<commit_message>
Adde linear feedback control
</commit_message>
<xml_diff>
--- a/outputs/chaotic_bursting/experiment_summary.docx
+++ b/outputs/chaotic_bursting/experiment_summary.docx
@@ -203,7 +203,7 @@
           </w:tcPr>
           <w:p>
             <w:r>
-              <w:t>2026-05-13 11:24:51</w:t>
+              <w:t>2026-05-26 10:53:50</w:t>
             </w:r>
           </w:p>
         </w:tc>
@@ -223,7 +223,7 @@
           </w:tcPr>
           <w:p>
             <w:r>
-              <w:t>gbrt</w:t>
+              <w:t>dummy</w:t>
             </w:r>
           </w:p>
         </w:tc>
@@ -253,7 +253,7 @@
           </w:tcPr>
           <w:p>
             <w:r>
-              <w:t>0.01331178</w:t>
+              <w:t>0.02653267</w:t>
             </w:r>
           </w:p>
         </w:tc>
@@ -263,7 +263,7 @@
           </w:tcPr>
           <w:p>
             <w:r>
-              <w:t>0.02697974</w:t>
+              <w:t>0.05377526</w:t>
             </w:r>
           </w:p>
         </w:tc>
@@ -273,7 +273,7 @@
           </w:tcPr>
           <w:p>
             <w:r>
-              <w:t>0.01849607</w:t>
+              <w:t>0.03644313</w:t>
             </w:r>
           </w:p>
         </w:tc>
@@ -283,7 +283,7 @@
           </w:tcPr>
           <w:p>
             <w:r>
-              <w:t>0.01818635</w:t>
+              <w:t>0.03611758</w:t>
             </w:r>
           </w:p>
         </w:tc>
@@ -293,7 +293,7 @@
           </w:tcPr>
           <w:p>
             <w:r>
-              <w:t>419</w:t>
+              <w:t>715</w:t>
             </w:r>
           </w:p>
         </w:tc>
@@ -303,7 +303,7 @@
           </w:tcPr>
           <w:p>
             <w:r>
-              <w:t>0.166094</w:t>
+              <w:t>0.073625</w:t>
             </w:r>
           </w:p>
         </w:tc>
@@ -313,7 +313,7 @@
           </w:tcPr>
           <w:p>
             <w:r>
-              <w:t>0.571785</w:t>
+              <w:t>0.512552</w:t>
             </w:r>
           </w:p>
         </w:tc>
@@ -323,7 +323,7 @@
           </w:tcPr>
           <w:p>
             <w:r>
-              <w:t>0.329853</w:t>
+              <w:t>0.147481</w:t>
             </w:r>
           </w:p>
         </w:tc>
@@ -333,7 +333,7 @@
           </w:tcPr>
           <w:p>
             <w:r>
-              <w:t>0.194551</w:t>
+              <w:t>0.280867</w:t>
             </w:r>
           </w:p>
         </w:tc>
@@ -343,7 +343,7 @@
           </w:tcPr>
           <w:p>
             <w:r>
-              <w:t>4.885115772339261e-08</w:t>
+              <w:t>3.2827576158867195e-08</w:t>
             </w:r>
           </w:p>
         </w:tc>
@@ -353,7 +353,7 @@
           </w:tcPr>
           <w:p>
             <w:r>
-              <w:t>388</w:t>
+              <w:t>372</w:t>
             </w:r>
           </w:p>
         </w:tc>

</xml_diff>